<commit_message>
TS 5.2 Kramam Sanskirt Tamil pushed
</commit_message>
<xml_diff>
--- a/TS-Kramam/TS-5.2/TS 5.2 Tamil Krama Paatam Corrections.docx
+++ b/TS-Kramam/TS-5.2/TS 5.2 Tamil Krama Paatam Corrections.docx
@@ -287,25 +287,7 @@
                 <w:sz w:val="28"/>
                 <w:szCs w:val="32"/>
               </w:rPr>
-              <w:t>1</w:t>
-            </w:r>
-            <w:r>
-              <w:rPr>
-                <w:rFonts w:cs="Arial"/>
-                <w:b/>
-                <w:sz w:val="28"/>
-                <w:szCs w:val="32"/>
-              </w:rPr>
-              <w:t>.</w:t>
-            </w:r>
-            <w:r>
-              <w:rPr>
-                <w:rFonts w:cs="Arial"/>
-                <w:b/>
-                <w:sz w:val="28"/>
-                <w:szCs w:val="32"/>
-              </w:rPr>
-              <w:t>6</w:t>
+              <w:t>1.6</w:t>
             </w:r>
             <w:r>
               <w:rPr>
@@ -402,17 +384,7 @@
                 <w:szCs w:val="28"/>
                 <w:lang w:val="it-IT"/>
               </w:rPr>
-              <w:t xml:space="preserve"> </w:t>
-            </w:r>
-            <w:r>
-              <w:rPr>
-                <w:rFonts w:cs="Arial"/>
-                <w:b/>
-                <w:sz w:val="28"/>
-                <w:szCs w:val="28"/>
-                <w:lang w:val="it-IT"/>
-              </w:rPr>
-              <w:t>6</w:t>
+              <w:t xml:space="preserve"> 6</w:t>
             </w:r>
           </w:p>
         </w:tc>
@@ -1107,25 +1079,7 @@
                 <w:sz w:val="28"/>
                 <w:szCs w:val="32"/>
               </w:rPr>
-              <w:t>2</w:t>
-            </w:r>
-            <w:r>
-              <w:rPr>
-                <w:rFonts w:cs="Arial"/>
-                <w:b/>
-                <w:sz w:val="28"/>
-                <w:szCs w:val="32"/>
-              </w:rPr>
-              <w:t>.</w:t>
-            </w:r>
-            <w:r>
-              <w:rPr>
-                <w:rFonts w:cs="Arial"/>
-                <w:b/>
-                <w:sz w:val="28"/>
-                <w:szCs w:val="32"/>
-              </w:rPr>
-              <w:t>2</w:t>
+              <w:t>2.2</w:t>
             </w:r>
             <w:r>
               <w:rPr>
@@ -3673,25 +3627,7 @@
                 <w:sz w:val="28"/>
                 <w:szCs w:val="32"/>
               </w:rPr>
-              <w:t>4</w:t>
-            </w:r>
-            <w:r>
-              <w:rPr>
-                <w:rFonts w:cs="Arial"/>
-                <w:b/>
-                <w:sz w:val="28"/>
-                <w:szCs w:val="32"/>
-              </w:rPr>
-              <w:t>.</w:t>
-            </w:r>
-            <w:r>
-              <w:rPr>
-                <w:rFonts w:cs="Arial"/>
-                <w:b/>
-                <w:sz w:val="28"/>
-                <w:szCs w:val="32"/>
-              </w:rPr>
-              <w:t>4</w:t>
+              <w:t>4.4</w:t>
             </w:r>
             <w:r>
               <w:rPr>
@@ -3778,16 +3714,17 @@
                 <w:szCs w:val="32"/>
                 <w:lang w:val="it-IT"/>
               </w:rPr>
-              <w:t xml:space="preserve">. - </w:t>
-            </w:r>
-            <w:r>
-              <w:rPr>
-                <w:rFonts w:cs="Arial"/>
-                <w:b/>
-                <w:szCs w:val="32"/>
+              <w:t>. -</w:t>
+            </w:r>
+            <w:r>
+              <w:rPr>
+                <w:rFonts w:cs="Arial"/>
+                <w:b/>
+                <w:sz w:val="28"/>
+                <w:szCs w:val="28"/>
                 <w:lang w:val="it-IT"/>
               </w:rPr>
-              <w:t>24</w:t>
+              <w:t xml:space="preserve"> 24</w:t>
             </w:r>
           </w:p>
         </w:tc>
@@ -7368,16 +7305,7 @@
                 <w:sz w:val="28"/>
                 <w:szCs w:val="32"/>
               </w:rPr>
-              <w:t>7.</w:t>
-            </w:r>
-            <w:r>
-              <w:rPr>
-                <w:rFonts w:cs="Arial"/>
-                <w:b/>
-                <w:sz w:val="28"/>
-                <w:szCs w:val="32"/>
-              </w:rPr>
-              <w:t>4</w:t>
+              <w:t>7.4</w:t>
             </w:r>
             <w:r>
               <w:rPr>
@@ -7464,17 +7392,7 @@
                 <w:szCs w:val="32"/>
                 <w:lang w:val="it-IT"/>
               </w:rPr>
-              <w:t>3</w:t>
-            </w:r>
-            <w:r>
-              <w:rPr>
-                <w:rFonts w:cs="Arial"/>
-                <w:b/>
-                <w:sz w:val="28"/>
-                <w:szCs w:val="32"/>
-                <w:lang w:val="it-IT"/>
-              </w:rPr>
-              <w:t>9</w:t>
+              <w:t>39</w:t>
             </w:r>
           </w:p>
         </w:tc>
@@ -8686,16 +8604,7 @@
                 <w:sz w:val="28"/>
                 <w:szCs w:val="32"/>
               </w:rPr>
-              <w:t>8.</w:t>
-            </w:r>
-            <w:r>
-              <w:rPr>
-                <w:rFonts w:cs="Arial"/>
-                <w:b/>
-                <w:sz w:val="28"/>
-                <w:szCs w:val="32"/>
-              </w:rPr>
-              <w:t>6</w:t>
+              <w:t>8.6</w:t>
             </w:r>
             <w:r>
               <w:rPr>
@@ -9368,25 +9277,7 @@
                 <w:sz w:val="28"/>
                 <w:szCs w:val="28"/>
               </w:rPr>
-              <w:t>T.S.5.2.</w:t>
-            </w:r>
-            <w:r>
-              <w:rPr>
-                <w:rFonts w:cs="Arial"/>
-                <w:b/>
-                <w:sz w:val="28"/>
-                <w:szCs w:val="28"/>
-              </w:rPr>
-              <w:t>10</w:t>
-            </w:r>
-            <w:r>
-              <w:rPr>
-                <w:rFonts w:cs="Arial"/>
-                <w:b/>
-                <w:sz w:val="28"/>
-                <w:szCs w:val="28"/>
-              </w:rPr>
-              <w:t>.6 – Kramam</w:t>
+              <w:t>T.S.5.2.10.6 – Kramam</w:t>
             </w:r>
           </w:p>
           <w:p>
@@ -9465,17 +9356,7 @@
                 <w:szCs w:val="28"/>
                 <w:lang w:val="it-IT"/>
               </w:rPr>
-              <w:t xml:space="preserve">Panchaati No. - </w:t>
-            </w:r>
-            <w:r>
-              <w:rPr>
-                <w:rFonts w:cs="Arial"/>
-                <w:b/>
-                <w:sz w:val="28"/>
-                <w:szCs w:val="28"/>
-                <w:lang w:val="it-IT"/>
-              </w:rPr>
-              <w:t>59</w:t>
+              <w:t>Panchaati No. - 59</w:t>
             </w:r>
           </w:p>
         </w:tc>

</xml_diff>